<commit_message>
Rewrite lab documentation to match the actual ED408 template (Problem+Algorithm / Program / Output+Analysis, with Parameter Modification sensitivity analysis per question)
</commit_message>
<xml_diff>
--- a/docs/Decision Tree ED408.docx
+++ b/docs/Decision Tree ED408.docx
@@ -4,1148 +4,812 @@
   <w:body>
     <w:p>
       <w:pPr>
-        <w:spacing w:after="40"/>
+        <w:spacing w:before="0" w:after="40" w:line="240" w:lineRule="auto"/>
         <w:jc w:val="center"/>
       </w:pPr>
       <w:r>
         <w:rPr>
+          <w:rFonts w:ascii="Times New Roman" w:hAnsi="Times New Roman"/>
           <w:b/>
-          <w:color w:val="1F4E79"/>
           <w:sz w:val="30"/>
         </w:rPr>
-        <w:t>Experiment 2: Decision Tree Classifier (scikit-learn)</w:t>
+        <w:t>Decision Tree Classifier (scikit-learn) with Visualization</w:t>
       </w:r>
     </w:p>
     <w:p>
       <w:pPr>
-        <w:spacing w:after="160"/>
+        <w:spacing w:before="0" w:after="200" w:line="240" w:lineRule="auto"/>
         <w:jc w:val="center"/>
       </w:pPr>
       <w:r>
         <w:rPr>
+          <w:rFonts w:ascii="Times New Roman" w:hAnsi="Times New Roman"/>
           <w:i/>
-          <w:sz w:val="18"/>
+          <w:sz w:val="20"/>
         </w:rPr>
         <w:t>ED408 — Statistical / Supervised Machine Learning Lab</w:t>
       </w:r>
     </w:p>
     <w:p>
       <w:pPr>
-        <w:spacing w:after="80"/>
+        <w:spacing w:before="200" w:after="80" w:line="240" w:lineRule="auto"/>
       </w:pPr>
       <w:r>
         <w:rPr>
+          <w:rFonts w:ascii="Times New Roman" w:hAnsi="Times New Roman"/>
           <w:b/>
-          <w:sz w:val="20"/>
+          <w:color w:val="1F3B5C"/>
+          <w:sz w:val="26"/>
+        </w:rPr>
+        <w:t>1. Problem + Algorithm</w:t>
+      </w:r>
+    </w:p>
+    <w:p>
+      <w:pPr>
+        <w:spacing w:before="0" w:after="80" w:line="240" w:lineRule="auto"/>
+      </w:pPr>
+      <w:r>
+        <w:rPr>
+          <w:rFonts w:ascii="Times New Roman" w:hAnsi="Times New Roman"/>
+          <w:b/>
+          <w:sz w:val="24"/>
+        </w:rPr>
+        <w:t xml:space="preserve">Experiment No.: </w:t>
+      </w:r>
+      <w:r>
+        <w:rPr>
+          <w:rFonts w:ascii="Times New Roman" w:hAnsi="Times New Roman"/>
+          <w:sz w:val="24"/>
+        </w:rPr>
+        <w:t>02</w:t>
+      </w:r>
+    </w:p>
+    <w:p>
+      <w:pPr>
+        <w:spacing w:before="0" w:after="80" w:line="240" w:lineRule="auto"/>
+      </w:pPr>
+      <w:r>
+        <w:rPr>
+          <w:rFonts w:ascii="Times New Roman" w:hAnsi="Times New Roman"/>
+          <w:b/>
+          <w:sz w:val="24"/>
+        </w:rPr>
+        <w:t xml:space="preserve">Title: </w:t>
+      </w:r>
+      <w:r>
+        <w:rPr>
+          <w:rFonts w:ascii="Times New Roman" w:hAnsi="Times New Roman"/>
+          <w:sz w:val="24"/>
+        </w:rPr>
+        <w:t>Decision Tree Classifier (scikit-learn) with Visualization</w:t>
+      </w:r>
+    </w:p>
+    <w:p>
+      <w:pPr>
+        <w:spacing w:before="0" w:after="80" w:line="240" w:lineRule="auto"/>
+      </w:pPr>
+      <w:r>
+        <w:rPr>
+          <w:rFonts w:ascii="Times New Roman" w:hAnsi="Times New Roman"/>
+          <w:b/>
+          <w:sz w:val="24"/>
         </w:rPr>
         <w:t xml:space="preserve">Aim: </w:t>
       </w:r>
       <w:r>
         <w:rPr>
-          <w:sz w:val="20"/>
+          <w:rFonts w:ascii="Times New Roman" w:hAnsi="Times New Roman"/>
+          <w:sz w:val="24"/>
         </w:rPr>
         <w:t>Build a Decision Tree classifier using scikit-learn and visualize the learned tree structure.</w:t>
       </w:r>
     </w:p>
     <w:p>
       <w:pPr>
-        <w:spacing w:after="80"/>
+        <w:spacing w:before="120" w:after="60" w:line="240" w:lineRule="auto"/>
       </w:pPr>
       <w:r>
         <w:rPr>
+          <w:rFonts w:ascii="Times New Roman" w:hAnsi="Times New Roman"/>
           <w:b/>
-          <w:sz w:val="20"/>
+          <w:sz w:val="24"/>
         </w:rPr>
-        <w:t xml:space="preserve">Dataset Used: </w:t>
-      </w:r>
-      <w:r>
-        <w:rPr>
-          <w:sz w:val="20"/>
-        </w:rPr>
-        <w:t>BSDS500 (Berkeley Segmentation Data Set) ships as natural images with hand-annotated object-boundary ground truth, not a tabular dataset. It was converted into a tabular binary-classification dataset (data/bsds_features.csv, built by scripts/build_dataset.py): one row per sampled pixel from all 200 BSDS500 training images, 10 features (R, G, B, gray, grad_mag, grad_dir, laplacian, local_std, x_norm, y_norm) capturing colour, gradient, texture and position, and label is_edge (1 if a majority of 6 human annotators marked the pixel as a segment boundary, else 0). 24,000 rows total, perfectly balanced (12,000 / 12,000). This same dataset is reused, unchanged, for every question in this lab.</w:t>
+        <w:t>Problem Statement:</w:t>
       </w:r>
     </w:p>
     <w:p>
       <w:pPr>
-        <w:spacing w:before="120" w:after="60"/>
+        <w:spacing w:before="0" w:after="120" w:line="240" w:lineRule="auto"/>
       </w:pPr>
       <w:r>
         <w:rPr>
-          <w:b/>
-          <w:color w:val="1F4E79"/>
-          <w:sz w:val="26"/>
+          <w:rFonts w:ascii="Times New Roman" w:hAnsi="Times New Roman"/>
+          <w:b w:val="0"/>
+          <w:i w:val="0"/>
+          <w:sz w:val="24"/>
         </w:rPr>
-        <w:t>Theory</w:t>
-      </w:r>
-    </w:p>
-    <w:p>
-      <w:r>
-        <w:rPr>
-          <w:sz w:val="20"/>
-        </w:rPr>
-        <w:t>A Decision Tree recursively partitions the feature space by choosing, at each node, the feature and threshold that most reduces impurity (Gini index by default in scikit-learn). Leaves are assigned the majority class of the training samples that reach them. Trees are easy to interpret and visualize but can overfit if grown too deep, hence max_depth / min_samples_leaf are used here as regularizers.</w:t>
+        <w:t>Learn a set of interpretable if-then rules over pixel colour, gradient, texture and position features that split the data into edge and non-edge pixels, and visualize the resulting decision tree. BSDS500 (Berkeley Segmentation Data Set) is an image-segmentation dataset, not tabular data, so a tabular dataset was derived from it (data/bsds_features.csv, built by scripts/build_dataset.py): 24,000 pixels sampled from the 200 BSDS500 training images, 10 features (R, G, B, gray, grad_mag, grad_dir, laplacian, local_std, x_norm, y_norm) capturing colour, gradient, texture and position, and label is_edge (1 if a majority of 6 human annotators marked the pixel as a segment boundary, else 0). This same dataset is used, unchanged, for every question in this lab.</w:t>
       </w:r>
     </w:p>
     <w:p>
       <w:pPr>
-        <w:spacing w:before="120" w:after="60"/>
+        <w:spacing w:before="120" w:after="60" w:line="240" w:lineRule="auto"/>
       </w:pPr>
       <w:r>
         <w:rPr>
+          <w:rFonts w:ascii="Times New Roman" w:hAnsi="Times New Roman"/>
           <w:b/>
-          <w:color w:val="1F4E79"/>
-          <w:sz w:val="26"/>
+          <w:sz w:val="24"/>
         </w:rPr>
-        <w:t>Code</w:t>
+        <w:t>Algorithm:</w:t>
       </w:r>
     </w:p>
     <w:p>
       <w:pPr>
-        <w:spacing w:before="0" w:after="0" w:line="240" w:lineRule="auto"/>
+        <w:spacing w:before="0" w:after="40" w:line="240" w:lineRule="auto"/>
       </w:pPr>
       <w:r>
         <w:rPr>
-          <w:rFonts w:ascii="Courier New" w:hAnsi="Courier New"/>
-          <w:sz w:val="15"/>
+          <w:rFonts w:ascii="Times New Roman" w:hAnsi="Times New Roman"/>
+          <w:sz w:val="24"/>
         </w:rPr>
-        <w:t>"""</w:t>
+        <w:t>1. Load the feature dataset (unscaled; trees are scale-invariant).</w:t>
       </w:r>
     </w:p>
     <w:p>
       <w:pPr>
-        <w:spacing w:before="0" w:after="0" w:line="240" w:lineRule="auto"/>
+        <w:spacing w:before="0" w:after="40" w:line="240" w:lineRule="auto"/>
       </w:pPr>
       <w:r>
         <w:rPr>
-          <w:rFonts w:ascii="Courier New" w:hAnsi="Courier New"/>
-          <w:sz w:val="15"/>
+          <w:rFonts w:ascii="Times New Roman" w:hAnsi="Times New Roman"/>
+          <w:sz w:val="24"/>
         </w:rPr>
-        <w:t>Q2 — Decision Tree classifier using scikit-learn, with tree visualization,</w:t>
+        <w:t>2. Split data into train (80%) and test (20%) sets.</w:t>
       </w:r>
     </w:p>
     <w:p>
       <w:pPr>
-        <w:spacing w:before="0" w:after="0" w:line="240" w:lineRule="auto"/>
+        <w:spacing w:before="0" w:after="40" w:line="240" w:lineRule="auto"/>
       </w:pPr>
       <w:r>
         <w:rPr>
-          <w:rFonts w:ascii="Courier New" w:hAnsi="Courier New"/>
-          <w:sz w:val="15"/>
+          <w:rFonts w:ascii="Times New Roman" w:hAnsi="Times New Roman"/>
+          <w:sz w:val="24"/>
         </w:rPr>
-        <w:t>on the BSDS500-derived edge-pixel dataset.</w:t>
+        <w:t>3. At the root, evaluate every feature/threshold split and choose the one that most reduces Gini impurity.</w:t>
       </w:r>
     </w:p>
     <w:p>
       <w:pPr>
-        <w:spacing w:before="0" w:after="0" w:line="240" w:lineRule="auto"/>
+        <w:spacing w:before="0" w:after="40" w:line="240" w:lineRule="auto"/>
       </w:pPr>
       <w:r>
         <w:rPr>
-          <w:rFonts w:ascii="Courier New" w:hAnsi="Courier New"/>
-          <w:sz w:val="15"/>
+          <w:rFonts w:ascii="Times New Roman" w:hAnsi="Times New Roman"/>
+          <w:sz w:val="24"/>
         </w:rPr>
-        <w:t>"""</w:t>
+        <w:t>4. Partition the data into left and right child nodes at that split.</w:t>
       </w:r>
     </w:p>
     <w:p>
       <w:pPr>
-        <w:spacing w:before="0" w:after="0" w:line="240" w:lineRule="auto"/>
+        <w:spacing w:before="0" w:after="40" w:line="240" w:lineRule="auto"/>
       </w:pPr>
       <w:r>
         <w:rPr>
-          <w:rFonts w:ascii="Courier New" w:hAnsi="Courier New"/>
-          <w:sz w:val="15"/>
+          <w:rFonts w:ascii="Times New Roman" w:hAnsi="Times New Roman"/>
+          <w:sz w:val="24"/>
         </w:rPr>
-        <w:t>import matplotlib.pyplot as plt</w:t>
+        <w:t>5. Recurse on each child node until max_depth or min_samples_leaf is reached.</w:t>
       </w:r>
     </w:p>
     <w:p>
       <w:pPr>
-        <w:spacing w:before="0" w:after="0" w:line="240" w:lineRule="auto"/>
+        <w:spacing w:before="0" w:after="40" w:line="240" w:lineRule="auto"/>
       </w:pPr>
       <w:r>
         <w:rPr>
-          <w:rFonts w:ascii="Courier New" w:hAnsi="Courier New"/>
-          <w:sz w:val="15"/>
+          <w:rFonts w:ascii="Times New Roman" w:hAnsi="Times New Roman"/>
+          <w:sz w:val="24"/>
         </w:rPr>
-        <w:t>from sklearn.tree import DecisionTreeClassifier, plot_tree</w:t>
+        <w:t>6. Assign each leaf the majority class of the training samples that reach it.</w:t>
       </w:r>
     </w:p>
     <w:p>
       <w:pPr>
-        <w:spacing w:before="0" w:after="0" w:line="240" w:lineRule="auto"/>
+        <w:spacing w:before="0" w:after="40" w:line="240" w:lineRule="auto"/>
       </w:pPr>
       <w:r>
         <w:rPr>
-          <w:rFonts w:ascii="Courier New" w:hAnsi="Courier New"/>
-          <w:sz w:val="15"/>
+          <w:rFonts w:ascii="Times New Roman" w:hAnsi="Times New Roman"/>
+          <w:sz w:val="24"/>
         </w:rPr>
-        <w:t>from sklearn.metrics import accuracy_score, confusion_matrix, classification_report</w:t>
+        <w:t>7. Predict new samples by traversing the tree from root to a leaf.</w:t>
       </w:r>
     </w:p>
     <w:p>
       <w:pPr>
-        <w:spacing w:before="0" w:after="0" w:line="240" w:lineRule="auto"/>
+        <w:spacing w:before="0" w:after="40" w:line="240" w:lineRule="auto"/>
       </w:pPr>
       <w:r>
         <w:rPr>
-          <w:rFonts w:ascii="Courier New" w:hAnsi="Courier New"/>
-          <w:sz w:val="15"/>
+          <w:rFonts w:ascii="Times New Roman" w:hAnsi="Times New Roman"/>
+          <w:sz w:val="24"/>
         </w:rPr>
-        <w:t xml:space="preserve"> </w:t>
+        <w:t>8. Visualize the trained tree structure and rank feature importances.</w:t>
       </w:r>
     </w:p>
     <w:p>
       <w:pPr>
-        <w:spacing w:before="0" w:after="0" w:line="240" w:lineRule="auto"/>
+        <w:spacing w:before="200" w:after="80" w:line="240" w:lineRule="auto"/>
       </w:pPr>
       <w:r>
         <w:rPr>
-          <w:rFonts w:ascii="Courier New" w:hAnsi="Courier New"/>
-          <w:sz w:val="15"/>
+          <w:rFonts w:ascii="Times New Roman" w:hAnsi="Times New Roman"/>
+          <w:b/>
+          <w:color w:val="1F3B5C"/>
+          <w:sz w:val="26"/>
         </w:rPr>
-        <w:t>from common import load_split, save_metrics, FIG_DIR, FEATURE_COLS</w:t>
+        <w:t>2. Program</w:t>
       </w:r>
     </w:p>
     <w:p>
       <w:pPr>
-        <w:spacing w:before="0" w:after="0" w:line="240" w:lineRule="auto"/>
+        <w:spacing w:before="0" w:after="60" w:line="240" w:lineRule="auto"/>
       </w:pPr>
       <w:r>
         <w:rPr>
-          <w:rFonts w:ascii="Courier New" w:hAnsi="Courier New"/>
-          <w:sz w:val="15"/>
+          <w:rFonts w:ascii="Times New Roman" w:hAnsi="Times New Roman"/>
+          <w:b w:val="0"/>
+          <w:i w:val="0"/>
+          <w:sz w:val="24"/>
         </w:rPr>
-        <w:t xml:space="preserve"> </w:t>
-      </w:r>
-    </w:p>
-    <w:p>
-      <w:pPr>
-        <w:spacing w:before="0" w:after="0" w:line="240" w:lineRule="auto"/>
-      </w:pPr>
-      <w:r>
-        <w:rPr>
-          <w:rFonts w:ascii="Courier New" w:hAnsi="Courier New"/>
-          <w:sz w:val="15"/>
-        </w:rPr>
-        <w:t xml:space="preserve"> </w:t>
-      </w:r>
-    </w:p>
-    <w:p>
-      <w:pPr>
-        <w:spacing w:before="0" w:after="0" w:line="240" w:lineRule="auto"/>
-      </w:pPr>
-      <w:r>
-        <w:rPr>
-          <w:rFonts w:ascii="Courier New" w:hAnsi="Courier New"/>
-          <w:sz w:val="15"/>
-        </w:rPr>
-        <w:t>def main():</w:t>
-      </w:r>
-    </w:p>
-    <w:p>
-      <w:pPr>
-        <w:spacing w:before="0" w:after="0" w:line="240" w:lineRule="auto"/>
-      </w:pPr>
-      <w:r>
-        <w:rPr>
-          <w:rFonts w:ascii="Courier New" w:hAnsi="Courier New"/>
-          <w:sz w:val="15"/>
-        </w:rPr>
-        <w:t xml:space="preserve">    # Decision trees don't need feature scaling; keep raw feature values.</w:t>
-      </w:r>
-    </w:p>
-    <w:p>
-      <w:pPr>
-        <w:spacing w:before="0" w:after="0" w:line="240" w:lineRule="auto"/>
-      </w:pPr>
-      <w:r>
-        <w:rPr>
-          <w:rFonts w:ascii="Courier New" w:hAnsi="Courier New"/>
-          <w:sz w:val="15"/>
-        </w:rPr>
-        <w:t xml:space="preserve">    X_train, X_test, y_train, y_test = load_split(scale=False)</w:t>
-      </w:r>
-    </w:p>
-    <w:p>
-      <w:pPr>
-        <w:spacing w:before="0" w:after="0" w:line="240" w:lineRule="auto"/>
-      </w:pPr>
-      <w:r>
-        <w:rPr>
-          <w:rFonts w:ascii="Courier New" w:hAnsi="Courier New"/>
-          <w:sz w:val="15"/>
-        </w:rPr>
-        <w:t xml:space="preserve">    print(f"train={X_train.shape}, test={X_test.shape}")</w:t>
-      </w:r>
-    </w:p>
-    <w:p>
-      <w:pPr>
-        <w:spacing w:before="0" w:after="0" w:line="240" w:lineRule="auto"/>
-      </w:pPr>
-      <w:r>
-        <w:rPr>
-          <w:rFonts w:ascii="Courier New" w:hAnsi="Courier New"/>
-          <w:sz w:val="15"/>
-        </w:rPr>
-        <w:t xml:space="preserve"> </w:t>
-      </w:r>
-    </w:p>
-    <w:p>
-      <w:pPr>
-        <w:spacing w:before="0" w:after="0" w:line="240" w:lineRule="auto"/>
-      </w:pPr>
-      <w:r>
-        <w:rPr>
-          <w:rFonts w:ascii="Courier New" w:hAnsi="Courier New"/>
-          <w:sz w:val="15"/>
-        </w:rPr>
-        <w:t xml:space="preserve">    clf = DecisionTreeClassifier(max_depth=6, min_samples_leaf=20, random_state=42)</w:t>
-      </w:r>
-    </w:p>
-    <w:p>
-      <w:pPr>
-        <w:spacing w:before="0" w:after="0" w:line="240" w:lineRule="auto"/>
-      </w:pPr>
-      <w:r>
-        <w:rPr>
-          <w:rFonts w:ascii="Courier New" w:hAnsi="Courier New"/>
-          <w:sz w:val="15"/>
-        </w:rPr>
-        <w:t xml:space="preserve">    clf.fit(X_train, y_train)</w:t>
-      </w:r>
-    </w:p>
-    <w:p>
-      <w:pPr>
-        <w:spacing w:before="0" w:after="0" w:line="240" w:lineRule="auto"/>
-      </w:pPr>
-      <w:r>
-        <w:rPr>
-          <w:rFonts w:ascii="Courier New" w:hAnsi="Courier New"/>
-          <w:sz w:val="15"/>
-        </w:rPr>
-        <w:t xml:space="preserve"> </w:t>
-      </w:r>
-    </w:p>
-    <w:p>
-      <w:pPr>
-        <w:spacing w:before="0" w:after="0" w:line="240" w:lineRule="auto"/>
-      </w:pPr>
-      <w:r>
-        <w:rPr>
-          <w:rFonts w:ascii="Courier New" w:hAnsi="Courier New"/>
-          <w:sz w:val="15"/>
-        </w:rPr>
-        <w:t xml:space="preserve">    preds = clf.predict(X_test)</w:t>
-      </w:r>
-    </w:p>
-    <w:p>
-      <w:pPr>
-        <w:spacing w:before="0" w:after="0" w:line="240" w:lineRule="auto"/>
-      </w:pPr>
-      <w:r>
-        <w:rPr>
-          <w:rFonts w:ascii="Courier New" w:hAnsi="Courier New"/>
-          <w:sz w:val="15"/>
-        </w:rPr>
-        <w:t xml:space="preserve">    acc = accuracy_score(y_test, preds)</w:t>
-      </w:r>
-    </w:p>
-    <w:p>
-      <w:pPr>
-        <w:spacing w:before="0" w:after="0" w:line="240" w:lineRule="auto"/>
-      </w:pPr>
-      <w:r>
-        <w:rPr>
-          <w:rFonts w:ascii="Courier New" w:hAnsi="Courier New"/>
-          <w:sz w:val="15"/>
-        </w:rPr>
-        <w:t xml:space="preserve">    cm = confusion_matrix(y_test, preds)</w:t>
-      </w:r>
-    </w:p>
-    <w:p>
-      <w:pPr>
-        <w:spacing w:before="0" w:after="0" w:line="240" w:lineRule="auto"/>
-      </w:pPr>
-      <w:r>
-        <w:rPr>
-          <w:rFonts w:ascii="Courier New" w:hAnsi="Courier New"/>
-          <w:sz w:val="15"/>
-        </w:rPr>
-        <w:t xml:space="preserve">    report = classification_report(y_test, preds, target_names=["non-edge", "edge"])</w:t>
-      </w:r>
-    </w:p>
-    <w:p>
-      <w:pPr>
-        <w:spacing w:before="0" w:after="0" w:line="240" w:lineRule="auto"/>
-      </w:pPr>
-      <w:r>
-        <w:rPr>
-          <w:rFonts w:ascii="Courier New" w:hAnsi="Courier New"/>
-          <w:sz w:val="15"/>
-        </w:rPr>
-        <w:t xml:space="preserve">    print(f"Test accuracy: {acc:.4f}")</w:t>
-      </w:r>
-    </w:p>
-    <w:p>
-      <w:pPr>
-        <w:spacing w:before="0" w:after="0" w:line="240" w:lineRule="auto"/>
-      </w:pPr>
-      <w:r>
-        <w:rPr>
-          <w:rFonts w:ascii="Courier New" w:hAnsi="Courier New"/>
-          <w:sz w:val="15"/>
-        </w:rPr>
-        <w:t xml:space="preserve">    print(report)</w:t>
-      </w:r>
-    </w:p>
-    <w:p>
-      <w:pPr>
-        <w:spacing w:before="0" w:after="0" w:line="240" w:lineRule="auto"/>
-      </w:pPr>
-      <w:r>
-        <w:rPr>
-          <w:rFonts w:ascii="Courier New" w:hAnsi="Courier New"/>
-          <w:sz w:val="15"/>
-        </w:rPr>
-        <w:t xml:space="preserve"> </w:t>
-      </w:r>
-    </w:p>
-    <w:p>
-      <w:pPr>
-        <w:spacing w:before="0" w:after="0" w:line="240" w:lineRule="auto"/>
-      </w:pPr>
-      <w:r>
-        <w:rPr>
-          <w:rFonts w:ascii="Courier New" w:hAnsi="Courier New"/>
-          <w:sz w:val="15"/>
-        </w:rPr>
-        <w:t xml:space="preserve">    # feature importances</w:t>
-      </w:r>
-    </w:p>
-    <w:p>
-      <w:pPr>
-        <w:spacing w:before="0" w:after="0" w:line="240" w:lineRule="auto"/>
-      </w:pPr>
-      <w:r>
-        <w:rPr>
-          <w:rFonts w:ascii="Courier New" w:hAnsi="Courier New"/>
-          <w:sz w:val="15"/>
-        </w:rPr>
-        <w:t xml:space="preserve">    importances = sorted(zip(FEATURE_COLS, clf.feature_importances_),</w:t>
-      </w:r>
-    </w:p>
-    <w:p>
-      <w:pPr>
-        <w:spacing w:before="0" w:after="0" w:line="240" w:lineRule="auto"/>
-      </w:pPr>
-      <w:r>
-        <w:rPr>
-          <w:rFonts w:ascii="Courier New" w:hAnsi="Courier New"/>
-          <w:sz w:val="15"/>
-        </w:rPr>
-        <w:t xml:space="preserve">                          key=lambda t: -t[1])</w:t>
-      </w:r>
-    </w:p>
-    <w:p>
-      <w:pPr>
-        <w:spacing w:before="0" w:after="0" w:line="240" w:lineRule="auto"/>
-      </w:pPr>
-      <w:r>
-        <w:rPr>
-          <w:rFonts w:ascii="Courier New" w:hAnsi="Courier New"/>
-          <w:sz w:val="15"/>
-        </w:rPr>
-        <w:t xml:space="preserve">    print("Feature importances:")</w:t>
-      </w:r>
-    </w:p>
-    <w:p>
-      <w:pPr>
-        <w:spacing w:before="0" w:after="0" w:line="240" w:lineRule="auto"/>
-      </w:pPr>
-      <w:r>
-        <w:rPr>
-          <w:rFonts w:ascii="Courier New" w:hAnsi="Courier New"/>
-          <w:sz w:val="15"/>
-        </w:rPr>
-        <w:t xml:space="preserve">    for name, imp in importances:</w:t>
-      </w:r>
-    </w:p>
-    <w:p>
-      <w:pPr>
-        <w:spacing w:before="0" w:after="0" w:line="240" w:lineRule="auto"/>
-      </w:pPr>
-      <w:r>
-        <w:rPr>
-          <w:rFonts w:ascii="Courier New" w:hAnsi="Courier New"/>
-          <w:sz w:val="15"/>
-        </w:rPr>
-        <w:t xml:space="preserve">        print(f"  {name:12s} {imp:.4f}")</w:t>
-      </w:r>
-    </w:p>
-    <w:p>
-      <w:pPr>
-        <w:spacing w:before="0" w:after="0" w:line="240" w:lineRule="auto"/>
-      </w:pPr>
-      <w:r>
-        <w:rPr>
-          <w:rFonts w:ascii="Courier New" w:hAnsi="Courier New"/>
-          <w:sz w:val="15"/>
-        </w:rPr>
-        <w:t xml:space="preserve"> </w:t>
-      </w:r>
-    </w:p>
-    <w:p>
-      <w:pPr>
-        <w:spacing w:before="0" w:after="0" w:line="240" w:lineRule="auto"/>
-      </w:pPr>
-      <w:r>
-        <w:rPr>
-          <w:rFonts w:ascii="Courier New" w:hAnsi="Courier New"/>
-          <w:sz w:val="15"/>
-        </w:rPr>
-        <w:t xml:space="preserve">    fig, ax = plt.subplots(figsize=(6, 4))</w:t>
-      </w:r>
-    </w:p>
-    <w:p>
-      <w:pPr>
-        <w:spacing w:before="0" w:after="0" w:line="240" w:lineRule="auto"/>
-      </w:pPr>
-      <w:r>
-        <w:rPr>
-          <w:rFonts w:ascii="Courier New" w:hAnsi="Courier New"/>
-          <w:sz w:val="15"/>
-        </w:rPr>
-        <w:t xml:space="preserve">    names, vals = zip(*importances)</w:t>
-      </w:r>
-    </w:p>
-    <w:p>
-      <w:pPr>
-        <w:spacing w:before="0" w:after="0" w:line="240" w:lineRule="auto"/>
-      </w:pPr>
-      <w:r>
-        <w:rPr>
-          <w:rFonts w:ascii="Courier New" w:hAnsi="Courier New"/>
-          <w:sz w:val="15"/>
-        </w:rPr>
-        <w:t xml:space="preserve">    ax.barh(names, vals, color="#4C72B0")</w:t>
-      </w:r>
-    </w:p>
-    <w:p>
-      <w:pPr>
-        <w:spacing w:before="0" w:after="0" w:line="240" w:lineRule="auto"/>
-      </w:pPr>
-      <w:r>
-        <w:rPr>
-          <w:rFonts w:ascii="Courier New" w:hAnsi="Courier New"/>
-          <w:sz w:val="15"/>
-        </w:rPr>
-        <w:t xml:space="preserve">    ax.invert_yaxis()</w:t>
-      </w:r>
-    </w:p>
-    <w:p>
-      <w:pPr>
-        <w:spacing w:before="0" w:after="0" w:line="240" w:lineRule="auto"/>
-      </w:pPr>
-      <w:r>
-        <w:rPr>
-          <w:rFonts w:ascii="Courier New" w:hAnsi="Courier New"/>
-          <w:sz w:val="15"/>
-        </w:rPr>
-        <w:t xml:space="preserve">    ax.set_xlabel("importance")</w:t>
-      </w:r>
-    </w:p>
-    <w:p>
-      <w:pPr>
-        <w:spacing w:before="0" w:after="0" w:line="240" w:lineRule="auto"/>
-      </w:pPr>
-      <w:r>
-        <w:rPr>
-          <w:rFonts w:ascii="Courier New" w:hAnsi="Courier New"/>
-          <w:sz w:val="15"/>
-        </w:rPr>
-        <w:t xml:space="preserve">    ax.set_title("Decision Tree feature importances")</w:t>
-      </w:r>
-    </w:p>
-    <w:p>
-      <w:pPr>
-        <w:spacing w:before="0" w:after="0" w:line="240" w:lineRule="auto"/>
-      </w:pPr>
-      <w:r>
-        <w:rPr>
-          <w:rFonts w:ascii="Courier New" w:hAnsi="Courier New"/>
-          <w:sz w:val="15"/>
-        </w:rPr>
-        <w:t xml:space="preserve">    plt.tight_layout()</w:t>
-      </w:r>
-    </w:p>
-    <w:p>
-      <w:pPr>
-        <w:spacing w:before="0" w:after="0" w:line="240" w:lineRule="auto"/>
-      </w:pPr>
-      <w:r>
-        <w:rPr>
-          <w:rFonts w:ascii="Courier New" w:hAnsi="Courier New"/>
-          <w:sz w:val="15"/>
-        </w:rPr>
-        <w:t xml:space="preserve">    plt.savefig(FIG_DIR / "q2_tree_feature_importance.png", bbox_inches="tight")</w:t>
-      </w:r>
-    </w:p>
-    <w:p>
-      <w:pPr>
-        <w:spacing w:before="0" w:after="0" w:line="240" w:lineRule="auto"/>
-      </w:pPr>
-      <w:r>
-        <w:rPr>
-          <w:rFonts w:ascii="Courier New" w:hAnsi="Courier New"/>
-          <w:sz w:val="15"/>
-        </w:rPr>
-        <w:t xml:space="preserve">    plt.close()</w:t>
-      </w:r>
-    </w:p>
-    <w:p>
-      <w:pPr>
-        <w:spacing w:before="0" w:after="0" w:line="240" w:lineRule="auto"/>
-      </w:pPr>
-      <w:r>
-        <w:rPr>
-          <w:rFonts w:ascii="Courier New" w:hAnsi="Courier New"/>
-          <w:sz w:val="15"/>
-        </w:rPr>
-        <w:t xml:space="preserve"> </w:t>
-      </w:r>
-    </w:p>
-    <w:p>
-      <w:pPr>
-        <w:spacing w:before="0" w:after="0" w:line="240" w:lineRule="auto"/>
-      </w:pPr>
-      <w:r>
-        <w:rPr>
-          <w:rFonts w:ascii="Courier New" w:hAnsi="Courier New"/>
-          <w:sz w:val="15"/>
-        </w:rPr>
-        <w:t xml:space="preserve">    # full-tree visualization</w:t>
-      </w:r>
-    </w:p>
-    <w:p>
-      <w:pPr>
-        <w:spacing w:before="0" w:after="0" w:line="240" w:lineRule="auto"/>
-      </w:pPr>
-      <w:r>
-        <w:rPr>
-          <w:rFonts w:ascii="Courier New" w:hAnsi="Courier New"/>
-          <w:sz w:val="15"/>
-        </w:rPr>
-        <w:t xml:space="preserve">    fig, ax = plt.subplots(figsize=(26, 12))</w:t>
-      </w:r>
-    </w:p>
-    <w:p>
-      <w:pPr>
-        <w:spacing w:before="0" w:after="0" w:line="240" w:lineRule="auto"/>
-      </w:pPr>
-      <w:r>
-        <w:rPr>
-          <w:rFonts w:ascii="Courier New" w:hAnsi="Courier New"/>
-          <w:sz w:val="15"/>
-        </w:rPr>
-        <w:t xml:space="preserve">    plot_tree(clf, feature_names=FEATURE_COLS, class_names=["non-edge", "edge"],</w:t>
-      </w:r>
-    </w:p>
-    <w:p>
-      <w:pPr>
-        <w:spacing w:before="0" w:after="0" w:line="240" w:lineRule="auto"/>
-      </w:pPr>
-      <w:r>
-        <w:rPr>
-          <w:rFonts w:ascii="Courier New" w:hAnsi="Courier New"/>
-          <w:sz w:val="15"/>
-        </w:rPr>
-        <w:t xml:space="preserve">              filled=True, rounded=True, fontsize=7, ax=ax)</w:t>
-      </w:r>
-    </w:p>
-    <w:p>
-      <w:pPr>
-        <w:spacing w:before="0" w:after="0" w:line="240" w:lineRule="auto"/>
-      </w:pPr>
-      <w:r>
-        <w:rPr>
-          <w:rFonts w:ascii="Courier New" w:hAnsi="Courier New"/>
-          <w:sz w:val="15"/>
-        </w:rPr>
-        <w:t xml:space="preserve">    ax.set_title(f"Decision Tree (max_depth=6)  test accuracy={acc:.3f}")</w:t>
-      </w:r>
-    </w:p>
-    <w:p>
-      <w:pPr>
-        <w:spacing w:before="0" w:after="0" w:line="240" w:lineRule="auto"/>
-      </w:pPr>
-      <w:r>
-        <w:rPr>
-          <w:rFonts w:ascii="Courier New" w:hAnsi="Courier New"/>
-          <w:sz w:val="15"/>
-        </w:rPr>
-        <w:t xml:space="preserve">    plt.savefig(FIG_DIR / "q2_tree_full.png", bbox_inches="tight", dpi=150)</w:t>
-      </w:r>
-    </w:p>
-    <w:p>
-      <w:pPr>
-        <w:spacing w:before="0" w:after="0" w:line="240" w:lineRule="auto"/>
-      </w:pPr>
-      <w:r>
-        <w:rPr>
-          <w:rFonts w:ascii="Courier New" w:hAnsi="Courier New"/>
-          <w:sz w:val="15"/>
-        </w:rPr>
-        <w:t xml:space="preserve">    plt.close()</w:t>
-      </w:r>
-    </w:p>
-    <w:p>
-      <w:pPr>
-        <w:spacing w:before="0" w:after="0" w:line="240" w:lineRule="auto"/>
-      </w:pPr>
-      <w:r>
-        <w:rPr>
-          <w:rFonts w:ascii="Courier New" w:hAnsi="Courier New"/>
-          <w:sz w:val="15"/>
-        </w:rPr>
-        <w:t xml:space="preserve"> </w:t>
-      </w:r>
-    </w:p>
-    <w:p>
-      <w:pPr>
-        <w:spacing w:before="0" w:after="0" w:line="240" w:lineRule="auto"/>
-      </w:pPr>
-      <w:r>
-        <w:rPr>
-          <w:rFonts w:ascii="Courier New" w:hAnsi="Courier New"/>
-          <w:sz w:val="15"/>
-        </w:rPr>
-        <w:t xml:space="preserve">    # shallow tree for a readable diagram</w:t>
-      </w:r>
-    </w:p>
-    <w:p>
-      <w:pPr>
-        <w:spacing w:before="0" w:after="0" w:line="240" w:lineRule="auto"/>
-      </w:pPr>
-      <w:r>
-        <w:rPr>
-          <w:rFonts w:ascii="Courier New" w:hAnsi="Courier New"/>
-          <w:sz w:val="15"/>
-        </w:rPr>
-        <w:t xml:space="preserve">    clf_shallow = DecisionTreeClassifier(max_depth=3, min_samples_leaf=20, random_state=42)</w:t>
-      </w:r>
-    </w:p>
-    <w:p>
-      <w:pPr>
-        <w:spacing w:before="0" w:after="0" w:line="240" w:lineRule="auto"/>
-      </w:pPr>
-      <w:r>
-        <w:rPr>
-          <w:rFonts w:ascii="Courier New" w:hAnsi="Courier New"/>
-          <w:sz w:val="15"/>
-        </w:rPr>
-        <w:t xml:space="preserve">    clf_shallow.fit(X_train, y_train)</w:t>
-      </w:r>
-    </w:p>
-    <w:p>
-      <w:pPr>
-        <w:spacing w:before="0" w:after="0" w:line="240" w:lineRule="auto"/>
-      </w:pPr>
-      <w:r>
-        <w:rPr>
-          <w:rFonts w:ascii="Courier New" w:hAnsi="Courier New"/>
-          <w:sz w:val="15"/>
-        </w:rPr>
-        <w:t xml:space="preserve">    preds_shallow = clf_shallow.predict(X_test)</w:t>
-      </w:r>
-    </w:p>
-    <w:p>
-      <w:pPr>
-        <w:spacing w:before="0" w:after="0" w:line="240" w:lineRule="auto"/>
-      </w:pPr>
-      <w:r>
-        <w:rPr>
-          <w:rFonts w:ascii="Courier New" w:hAnsi="Courier New"/>
-          <w:sz w:val="15"/>
-        </w:rPr>
-        <w:t xml:space="preserve">    acc_shallow = accuracy_score(y_test, preds_shallow)</w:t>
-      </w:r>
-    </w:p>
-    <w:p>
-      <w:pPr>
-        <w:spacing w:before="0" w:after="0" w:line="240" w:lineRule="auto"/>
-      </w:pPr>
-      <w:r>
-        <w:rPr>
-          <w:rFonts w:ascii="Courier New" w:hAnsi="Courier New"/>
-          <w:sz w:val="15"/>
-        </w:rPr>
-        <w:t xml:space="preserve"> </w:t>
-      </w:r>
-    </w:p>
-    <w:p>
-      <w:pPr>
-        <w:spacing w:before="0" w:after="0" w:line="240" w:lineRule="auto"/>
-      </w:pPr>
-      <w:r>
-        <w:rPr>
-          <w:rFonts w:ascii="Courier New" w:hAnsi="Courier New"/>
-          <w:sz w:val="15"/>
-        </w:rPr>
-        <w:t xml:space="preserve">    fig, ax = plt.subplots(figsize=(16, 8))</w:t>
-      </w:r>
-    </w:p>
-    <w:p>
-      <w:pPr>
-        <w:spacing w:before="0" w:after="0" w:line="240" w:lineRule="auto"/>
-      </w:pPr>
-      <w:r>
-        <w:rPr>
-          <w:rFonts w:ascii="Courier New" w:hAnsi="Courier New"/>
-          <w:sz w:val="15"/>
-        </w:rPr>
-        <w:t xml:space="preserve">    plot_tree(clf_shallow, feature_names=FEATURE_COLS, class_names=["non-edge", "edge"],</w:t>
-      </w:r>
-    </w:p>
-    <w:p>
-      <w:pPr>
-        <w:spacing w:before="0" w:after="0" w:line="240" w:lineRule="auto"/>
-      </w:pPr>
-      <w:r>
-        <w:rPr>
-          <w:rFonts w:ascii="Courier New" w:hAnsi="Courier New"/>
-          <w:sz w:val="15"/>
-        </w:rPr>
-        <w:t xml:space="preserve">              filled=True, rounded=True, fontsize=10, ax=ax)</w:t>
-      </w:r>
-    </w:p>
-    <w:p>
-      <w:pPr>
-        <w:spacing w:before="0" w:after="0" w:line="240" w:lineRule="auto"/>
-      </w:pPr>
-      <w:r>
-        <w:rPr>
-          <w:rFonts w:ascii="Courier New" w:hAnsi="Courier New"/>
-          <w:sz w:val="15"/>
-        </w:rPr>
-        <w:t xml:space="preserve">    ax.set_title(f"Decision Tree (max_depth=3, readable)  test accuracy={acc_shallow:.3f}")</w:t>
-      </w:r>
-    </w:p>
-    <w:p>
-      <w:pPr>
-        <w:spacing w:before="0" w:after="0" w:line="240" w:lineRule="auto"/>
-      </w:pPr>
-      <w:r>
-        <w:rPr>
-          <w:rFonts w:ascii="Courier New" w:hAnsi="Courier New"/>
-          <w:sz w:val="15"/>
-        </w:rPr>
-        <w:t xml:space="preserve">    plt.savefig(FIG_DIR / "q2_tree_shallow.png", bbox_inches="tight", dpi=150)</w:t>
-      </w:r>
-    </w:p>
-    <w:p>
-      <w:pPr>
-        <w:spacing w:before="0" w:after="0" w:line="240" w:lineRule="auto"/>
-      </w:pPr>
-      <w:r>
-        <w:rPr>
-          <w:rFonts w:ascii="Courier New" w:hAnsi="Courier New"/>
-          <w:sz w:val="15"/>
-        </w:rPr>
-        <w:t xml:space="preserve">    plt.close()</w:t>
-      </w:r>
-    </w:p>
-    <w:p>
-      <w:pPr>
-        <w:spacing w:before="0" w:after="0" w:line="240" w:lineRule="auto"/>
-      </w:pPr>
-      <w:r>
-        <w:rPr>
-          <w:rFonts w:ascii="Courier New" w:hAnsi="Courier New"/>
-          <w:sz w:val="15"/>
-        </w:rPr>
-        <w:t xml:space="preserve"> </w:t>
-      </w:r>
-    </w:p>
-    <w:p>
-      <w:pPr>
-        <w:spacing w:before="0" w:after="0" w:line="240" w:lineRule="auto"/>
-      </w:pPr>
-      <w:r>
-        <w:rPr>
-          <w:rFonts w:ascii="Courier New" w:hAnsi="Courier New"/>
-          <w:sz w:val="15"/>
-        </w:rPr>
-        <w:t xml:space="preserve">    save_metrics("q2_decision_tree", {</w:t>
-      </w:r>
-    </w:p>
-    <w:p>
-      <w:pPr>
-        <w:spacing w:before="0" w:after="0" w:line="240" w:lineRule="auto"/>
-      </w:pPr>
-      <w:r>
-        <w:rPr>
-          <w:rFonts w:ascii="Courier New" w:hAnsi="Courier New"/>
-          <w:sz w:val="15"/>
-        </w:rPr>
-        <w:t xml:space="preserve">        "depth6_test_accuracy": acc,</w:t>
-      </w:r>
-    </w:p>
-    <w:p>
-      <w:pPr>
-        <w:spacing w:before="0" w:after="0" w:line="240" w:lineRule="auto"/>
-      </w:pPr>
-      <w:r>
-        <w:rPr>
-          <w:rFonts w:ascii="Courier New" w:hAnsi="Courier New"/>
-          <w:sz w:val="15"/>
-        </w:rPr>
-        <w:t xml:space="preserve">        "depth3_test_accuracy": acc_shallow,</w:t>
-      </w:r>
-    </w:p>
-    <w:p>
-      <w:pPr>
-        <w:spacing w:before="0" w:after="0" w:line="240" w:lineRule="auto"/>
-      </w:pPr>
-      <w:r>
-        <w:rPr>
-          <w:rFonts w:ascii="Courier New" w:hAnsi="Courier New"/>
-          <w:sz w:val="15"/>
-        </w:rPr>
-        <w:t xml:space="preserve">        "confusion_matrix": cm.tolist(),</w:t>
-      </w:r>
-    </w:p>
-    <w:p>
-      <w:pPr>
-        <w:spacing w:before="0" w:after="0" w:line="240" w:lineRule="auto"/>
-      </w:pPr>
-      <w:r>
-        <w:rPr>
-          <w:rFonts w:ascii="Courier New" w:hAnsi="Courier New"/>
-          <w:sz w:val="15"/>
-        </w:rPr>
-        <w:t xml:space="preserve">        "classification_report": report,</w:t>
-      </w:r>
-    </w:p>
-    <w:p>
-      <w:pPr>
-        <w:spacing w:before="0" w:after="0" w:line="240" w:lineRule="auto"/>
-      </w:pPr>
-      <w:r>
-        <w:rPr>
-          <w:rFonts w:ascii="Courier New" w:hAnsi="Courier New"/>
-          <w:sz w:val="15"/>
-        </w:rPr>
-        <w:t xml:space="preserve">        "feature_importances": {n: float(v) for n, v in importances},</w:t>
-      </w:r>
-    </w:p>
-    <w:p>
-      <w:pPr>
-        <w:spacing w:before="0" w:after="0" w:line="240" w:lineRule="auto"/>
-      </w:pPr>
-      <w:r>
-        <w:rPr>
-          <w:rFonts w:ascii="Courier New" w:hAnsi="Courier New"/>
-          <w:sz w:val="15"/>
-        </w:rPr>
-        <w:t xml:space="preserve">    })</w:t>
-      </w:r>
-    </w:p>
-    <w:p>
-      <w:pPr>
-        <w:spacing w:before="0" w:after="0" w:line="240" w:lineRule="auto"/>
-      </w:pPr>
-      <w:r>
-        <w:rPr>
-          <w:rFonts w:ascii="Courier New" w:hAnsi="Courier New"/>
-          <w:sz w:val="15"/>
-        </w:rPr>
-        <w:t xml:space="preserve"> </w:t>
-      </w:r>
-    </w:p>
-    <w:p>
-      <w:pPr>
-        <w:spacing w:before="0" w:after="0" w:line="240" w:lineRule="auto"/>
-      </w:pPr>
-      <w:r>
-        <w:rPr>
-          <w:rFonts w:ascii="Courier New" w:hAnsi="Courier New"/>
-          <w:sz w:val="15"/>
-        </w:rPr>
-        <w:t xml:space="preserve"> </w:t>
-      </w:r>
-    </w:p>
-    <w:p>
-      <w:pPr>
-        <w:spacing w:before="0" w:after="0" w:line="240" w:lineRule="auto"/>
-      </w:pPr>
-      <w:r>
-        <w:rPr>
-          <w:rFonts w:ascii="Courier New" w:hAnsi="Courier New"/>
-          <w:sz w:val="15"/>
-        </w:rPr>
-        <w:t>if __name__ == "__main__":</w:t>
-      </w:r>
-    </w:p>
-    <w:p>
-      <w:pPr>
-        <w:spacing w:before="0" w:after="0" w:line="240" w:lineRule="auto"/>
-      </w:pPr>
-      <w:r>
-        <w:rPr>
-          <w:rFonts w:ascii="Courier New" w:hAnsi="Courier New"/>
-          <w:sz w:val="15"/>
-        </w:rPr>
-        <w:t xml:space="preserve">    main()</w:t>
-      </w:r>
-    </w:p>
-    <w:p>
-      <w:pPr>
-        <w:spacing w:before="120" w:after="60"/>
-      </w:pPr>
-      <w:r>
-        <w:rPr>
-          <w:b/>
-          <w:color w:val="1F4E79"/>
-          <w:sz w:val="26"/>
-        </w:rPr>
-        <w:t>Output</w:t>
+        <w:t>Key code section (function definitions, core algorithm, and key parameter settings):</w:t>
       </w:r>
     </w:p>
     <w:tbl>
       <w:tblPr>
-        <w:tblStyle w:val="LightGrid-Accent1"/>
         <w:tblW w:type="auto" w:w="0"/>
+        <w:tblLayout w:type="autofit"/>
         <w:tblLook w:firstColumn="1" w:firstRow="1" w:lastColumn="0" w:lastRow="0" w:noHBand="0" w:noVBand="1" w:val="04A0"/>
       </w:tblPr>
       <w:tblGrid>
-        <w:gridCol w:w="5112"/>
-        <w:gridCol w:w="5112"/>
+        <w:gridCol w:w="9314"/>
       </w:tblGrid>
       <w:tr>
         <w:tc>
           <w:tcPr>
-            <w:tcW w:type="dxa" w:w="5112"/>
+            <w:tcW w:type="dxa" w:w="9314"/>
+            <w:shd w:val="clear" w:fill="F2F2F2"/>
           </w:tcPr>
           <w:p>
+            <w:pPr>
+              <w:spacing w:before="0" w:after="0" w:line="240" w:lineRule="auto"/>
+            </w:pPr>
+            <w:r/>
             <w:r>
               <w:rPr>
-                <w:b/>
-                <w:sz w:val="18"/>
+                <w:rFonts w:ascii="Consolas" w:hAnsi="Consolas"/>
+                <w:sz w:val="19"/>
               </w:rPr>
-              <w:t>Metric</w:t>
+              <w:t>from sklearn.tree import DecisionTreeClassifier, plot_tree</w:t>
             </w:r>
           </w:p>
-        </w:tc>
-        <w:tc>
-          <w:tcPr>
-            <w:tcW w:type="dxa" w:w="5112"/>
-          </w:tcPr>
           <w:p>
+            <w:pPr>
+              <w:spacing w:before="0" w:after="0" w:line="240" w:lineRule="auto"/>
+            </w:pPr>
             <w:r>
               <w:rPr>
-                <w:b/>
-                <w:sz w:val="18"/>
+                <w:rFonts w:ascii="Consolas" w:hAnsi="Consolas"/>
+                <w:sz w:val="19"/>
               </w:rPr>
-              <w:t>Value</w:t>
+              <w:t xml:space="preserve"> </w:t>
             </w:r>
           </w:p>
-        </w:tc>
-      </w:tr>
-      <w:tr>
-        <w:tc>
-          <w:tcPr>
-            <w:tcW w:type="dxa" w:w="5112"/>
-          </w:tcPr>
           <w:p>
+            <w:pPr>
+              <w:spacing w:before="0" w:after="0" w:line="240" w:lineRule="auto"/>
+            </w:pPr>
             <w:r>
               <w:rPr>
-                <w:sz w:val="18"/>
+                <w:rFonts w:ascii="Consolas" w:hAnsi="Consolas"/>
+                <w:sz w:val="19"/>
               </w:rPr>
-              <w:t>Test accuracy (depth=6)</w:t>
+              <w:t>clf = DecisionTreeClassifier(</w:t>
             </w:r>
           </w:p>
-        </w:tc>
-        <w:tc>
-          <w:tcPr>
-            <w:tcW w:type="dxa" w:w="5112"/>
-          </w:tcPr>
           <w:p>
+            <w:pPr>
+              <w:spacing w:before="0" w:after="0" w:line="240" w:lineRule="auto"/>
+            </w:pPr>
             <w:r>
               <w:rPr>
-                <w:sz w:val="18"/>
+                <w:rFonts w:ascii="Consolas" w:hAnsi="Consolas"/>
+                <w:sz w:val="19"/>
               </w:rPr>
-              <w:t>0.7531</w:t>
+              <w:t xml:space="preserve">    max_depth=6, min_samples_leaf=20, random_state=42)</w:t>
             </w:r>
           </w:p>
-        </w:tc>
-      </w:tr>
-      <w:tr>
-        <w:tc>
-          <w:tcPr>
-            <w:tcW w:type="dxa" w:w="5112"/>
-          </w:tcPr>
           <w:p>
+            <w:pPr>
+              <w:spacing w:before="0" w:after="0" w:line="240" w:lineRule="auto"/>
+            </w:pPr>
             <w:r>
               <w:rPr>
-                <w:sz w:val="18"/>
+                <w:rFonts w:ascii="Consolas" w:hAnsi="Consolas"/>
+                <w:sz w:val="19"/>
               </w:rPr>
-              <w:t>Test accuracy (depth=3)</w:t>
+              <w:t>clf.fit(X_train, y_train)</w:t>
             </w:r>
           </w:p>
-        </w:tc>
-        <w:tc>
-          <w:tcPr>
-            <w:tcW w:type="dxa" w:w="5112"/>
-          </w:tcPr>
           <w:p>
+            <w:pPr>
+              <w:spacing w:before="0" w:after="0" w:line="240" w:lineRule="auto"/>
+            </w:pPr>
             <w:r>
               <w:rPr>
-                <w:sz w:val="18"/>
+                <w:rFonts w:ascii="Consolas" w:hAnsi="Consolas"/>
+                <w:sz w:val="19"/>
               </w:rPr>
-              <w:t>0.7356</w:t>
+              <w:t>preds = clf.predict(X_test)</w:t>
             </w:r>
           </w:p>
-        </w:tc>
-      </w:tr>
-      <w:tr>
-        <w:tc>
-          <w:tcPr>
-            <w:tcW w:type="dxa" w:w="5112"/>
-          </w:tcPr>
           <w:p>
+            <w:pPr>
+              <w:spacing w:before="0" w:after="0" w:line="240" w:lineRule="auto"/>
+            </w:pPr>
             <w:r>
               <w:rPr>
-                <w:sz w:val="18"/>
+                <w:rFonts w:ascii="Consolas" w:hAnsi="Consolas"/>
+                <w:sz w:val="19"/>
               </w:rPr>
-              <w:t>Top feature</w:t>
+              <w:t>acc = accuracy_score(y_test, preds)</w:t>
             </w:r>
           </w:p>
-        </w:tc>
-        <w:tc>
-          <w:tcPr>
-            <w:tcW w:type="dxa" w:w="5112"/>
-          </w:tcPr>
           <w:p>
+            <w:pPr>
+              <w:spacing w:before="0" w:after="0" w:line="240" w:lineRule="auto"/>
+            </w:pPr>
             <w:r>
               <w:rPr>
-                <w:sz w:val="18"/>
+                <w:rFonts w:ascii="Consolas" w:hAnsi="Consolas"/>
+                <w:sz w:val="19"/>
               </w:rPr>
-              <w:t>local_std (importance=0.885)</w:t>
+              <w:t xml:space="preserve"> </w:t>
+            </w:r>
+          </w:p>
+          <w:p>
+            <w:pPr>
+              <w:spacing w:before="0" w:after="0" w:line="240" w:lineRule="auto"/>
+            </w:pPr>
+            <w:r>
+              <w:rPr>
+                <w:rFonts w:ascii="Consolas" w:hAnsi="Consolas"/>
+                <w:sz w:val="19"/>
+              </w:rPr>
+              <w:t># feature importances (Gini-based)</w:t>
+            </w:r>
+          </w:p>
+          <w:p>
+            <w:pPr>
+              <w:spacing w:before="0" w:after="0" w:line="240" w:lineRule="auto"/>
+            </w:pPr>
+            <w:r>
+              <w:rPr>
+                <w:rFonts w:ascii="Consolas" w:hAnsi="Consolas"/>
+                <w:sz w:val="19"/>
+              </w:rPr>
+              <w:t>importances = sorted(zip(FEATURE_COLS, clf.feature_importances_),</w:t>
+            </w:r>
+          </w:p>
+          <w:p>
+            <w:pPr>
+              <w:spacing w:before="0" w:after="0" w:line="240" w:lineRule="auto"/>
+            </w:pPr>
+            <w:r>
+              <w:rPr>
+                <w:rFonts w:ascii="Consolas" w:hAnsi="Consolas"/>
+                <w:sz w:val="19"/>
+              </w:rPr>
+              <w:t xml:space="preserve">                      key=lambda t: -t[1])</w:t>
+            </w:r>
+          </w:p>
+          <w:p>
+            <w:pPr>
+              <w:spacing w:before="0" w:after="0" w:line="240" w:lineRule="auto"/>
+            </w:pPr>
+            <w:r>
+              <w:rPr>
+                <w:rFonts w:ascii="Consolas" w:hAnsi="Consolas"/>
+                <w:sz w:val="19"/>
+              </w:rPr>
+              <w:t xml:space="preserve"> </w:t>
+            </w:r>
+          </w:p>
+          <w:p>
+            <w:pPr>
+              <w:spacing w:before="0" w:after="0" w:line="240" w:lineRule="auto"/>
+            </w:pPr>
+            <w:r>
+              <w:rPr>
+                <w:rFonts w:ascii="Consolas" w:hAnsi="Consolas"/>
+                <w:sz w:val="19"/>
+              </w:rPr>
+              <w:t># tree visualization</w:t>
+            </w:r>
+          </w:p>
+          <w:p>
+            <w:pPr>
+              <w:spacing w:before="0" w:after="0" w:line="240" w:lineRule="auto"/>
+            </w:pPr>
+            <w:r>
+              <w:rPr>
+                <w:rFonts w:ascii="Consolas" w:hAnsi="Consolas"/>
+                <w:sz w:val="19"/>
+              </w:rPr>
+              <w:t>plot_tree(clf, feature_names=FEATURE_COLS,</w:t>
+            </w:r>
+          </w:p>
+          <w:p>
+            <w:pPr>
+              <w:spacing w:before="0" w:after="0" w:line="240" w:lineRule="auto"/>
+            </w:pPr>
+            <w:r>
+              <w:rPr>
+                <w:rFonts w:ascii="Consolas" w:hAnsi="Consolas"/>
+                <w:sz w:val="19"/>
+              </w:rPr>
+              <w:t xml:space="preserve">          class_names=["non-edge", "edge"],</w:t>
+            </w:r>
+          </w:p>
+          <w:p>
+            <w:pPr>
+              <w:spacing w:before="0" w:after="0" w:line="240" w:lineRule="auto"/>
+            </w:pPr>
+            <w:r>
+              <w:rPr>
+                <w:rFonts w:ascii="Consolas" w:hAnsi="Consolas"/>
+                <w:sz w:val="19"/>
+              </w:rPr>
+              <w:t xml:space="preserve">          filled=True, rounded=True, fontsize=10)</w:t>
             </w:r>
           </w:p>
         </w:tc>
       </w:tr>
     </w:tbl>
-    <w:p/>
     <w:p>
       <w:pPr>
+        <w:spacing w:before="0" w:after="160" w:line="240" w:lineRule="auto"/>
+      </w:pPr>
+      <w:r>
+        <w:rPr>
+          <w:rFonts w:ascii="Times New Roman" w:hAnsi="Times New Roman"/>
+          <w:sz w:val="24"/>
+        </w:rPr>
+        <w:t xml:space="preserve">Full executable program: </w:t>
+      </w:r>
+      <w:r>
+        <w:rPr>
+          <w:rFonts w:ascii="Times New Roman" w:hAnsi="Times New Roman"/>
+          <w:i/>
+          <w:sz w:val="24"/>
+        </w:rPr>
+        <w:t>scripts/q2_decision_tree.py</w:t>
+      </w:r>
+      <w:r>
+        <w:rPr>
+          <w:rFonts w:ascii="Times New Roman" w:hAnsi="Times New Roman"/>
+          <w:sz w:val="24"/>
+        </w:rPr>
+        <w:t xml:space="preserve"> — maintained digitally on GitHub: </w:t>
+      </w:r>
+      <w:r>
+        <w:rPr>
+          <w:rFonts w:ascii="Times New Roman" w:hAnsi="Times New Roman"/>
+          <w:i/>
+          <w:sz w:val="24"/>
+        </w:rPr>
+        <w:t>https://github.com/Ak62007/SML-Lab-ED408</w:t>
+      </w:r>
+    </w:p>
+    <w:p>
+      <w:pPr>
+        <w:spacing w:before="200" w:after="80" w:line="240" w:lineRule="auto"/>
+      </w:pPr>
+      <w:r>
+        <w:rPr>
+          <w:rFonts w:ascii="Times New Roman" w:hAnsi="Times New Roman"/>
+          <w:b/>
+          <w:color w:val="1F3B5C"/>
+          <w:sz w:val="26"/>
+        </w:rPr>
+        <w:t>3. Output + Analysis</w:t>
+      </w:r>
+    </w:p>
+    <w:p>
+      <w:pPr>
+        <w:spacing w:before="120" w:after="60" w:line="240" w:lineRule="auto"/>
+      </w:pPr>
+      <w:r>
+        <w:rPr>
+          <w:rFonts w:ascii="Times New Roman" w:hAnsi="Times New Roman"/>
+          <w:b/>
+          <w:sz w:val="24"/>
+        </w:rPr>
+        <w:t>Parameters:</w:t>
+      </w:r>
+    </w:p>
+    <w:p>
+      <w:pPr>
+        <w:spacing w:before="0" w:after="40" w:line="240" w:lineRule="auto"/>
+      </w:pPr>
+      <w:r>
+        <w:rPr>
+          <w:rFonts w:ascii="Times New Roman" w:hAnsi="Times New Roman"/>
+          <w:b/>
+          <w:sz w:val="24"/>
+        </w:rPr>
+        <w:t xml:space="preserve">Feature Set: </w:t>
+      </w:r>
+      <w:r>
+        <w:rPr>
+          <w:rFonts w:ascii="Times New Roman" w:hAnsi="Times New Roman"/>
+          <w:sz w:val="24"/>
+        </w:rPr>
+        <w:t>10 features (unscaled)</w:t>
+      </w:r>
+    </w:p>
+    <w:p>
+      <w:pPr>
+        <w:spacing w:before="0" w:after="40" w:line="240" w:lineRule="auto"/>
+      </w:pPr>
+      <w:r>
+        <w:rPr>
+          <w:rFonts w:ascii="Times New Roman" w:hAnsi="Times New Roman"/>
+          <w:b/>
+          <w:sz w:val="24"/>
+        </w:rPr>
+        <w:t xml:space="preserve">Train / Test Split: </w:t>
+      </w:r>
+      <w:r>
+        <w:rPr>
+          <w:rFonts w:ascii="Times New Roman" w:hAnsi="Times New Roman"/>
+          <w:sz w:val="24"/>
+        </w:rPr>
+        <w:t>19,200 / 4,800 samples (80/20)</w:t>
+      </w:r>
+    </w:p>
+    <w:p>
+      <w:pPr>
+        <w:spacing w:before="0" w:after="40" w:line="240" w:lineRule="auto"/>
+      </w:pPr>
+      <w:r>
+        <w:rPr>
+          <w:rFonts w:ascii="Times New Roman" w:hAnsi="Times New Roman"/>
+          <w:b/>
+          <w:sz w:val="24"/>
+        </w:rPr>
+        <w:t xml:space="preserve">Splitting Criterion: </w:t>
+      </w:r>
+      <w:r>
+        <w:rPr>
+          <w:rFonts w:ascii="Times New Roman" w:hAnsi="Times New Roman"/>
+          <w:sz w:val="24"/>
+        </w:rPr>
+        <w:t>Gini impurity</w:t>
+      </w:r>
+    </w:p>
+    <w:p>
+      <w:pPr>
+        <w:spacing w:before="0" w:after="40" w:line="240" w:lineRule="auto"/>
+      </w:pPr>
+      <w:r>
+        <w:rPr>
+          <w:rFonts w:ascii="Times New Roman" w:hAnsi="Times New Roman"/>
+          <w:b/>
+          <w:sz w:val="24"/>
+        </w:rPr>
+        <w:t xml:space="preserve">max_depth: </w:t>
+      </w:r>
+      <w:r>
+        <w:rPr>
+          <w:rFonts w:ascii="Times New Roman" w:hAnsi="Times New Roman"/>
+          <w:sz w:val="24"/>
+        </w:rPr>
+        <w:t>6</w:t>
+      </w:r>
+    </w:p>
+    <w:p>
+      <w:pPr>
+        <w:spacing w:before="0" w:after="40" w:line="240" w:lineRule="auto"/>
+      </w:pPr>
+      <w:r>
+        <w:rPr>
+          <w:rFonts w:ascii="Times New Roman" w:hAnsi="Times New Roman"/>
+          <w:b/>
+          <w:sz w:val="24"/>
+        </w:rPr>
+        <w:t xml:space="preserve">min_samples_leaf: </w:t>
+      </w:r>
+      <w:r>
+        <w:rPr>
+          <w:rFonts w:ascii="Times New Roman" w:hAnsi="Times New Roman"/>
+          <w:sz w:val="24"/>
+        </w:rPr>
+        <w:t>20</w:t>
+      </w:r>
+    </w:p>
+    <w:p>
+      <w:pPr>
+        <w:spacing w:before="120" w:after="60" w:line="240" w:lineRule="auto"/>
+      </w:pPr>
+      <w:r>
+        <w:rPr>
+          <w:rFonts w:ascii="Times New Roman" w:hAnsi="Times New Roman"/>
+          <w:b/>
+          <w:sz w:val="24"/>
+        </w:rPr>
+        <w:t>Program Execution:</w:t>
+      </w:r>
+    </w:p>
+    <w:p>
+      <w:pPr>
+        <w:spacing w:before="0" w:after="40" w:line="240" w:lineRule="auto"/>
+      </w:pPr>
+      <w:r>
+        <w:rPr>
+          <w:rFonts w:ascii="Times New Roman" w:hAnsi="Times New Roman"/>
+          <w:b/>
+          <w:sz w:val="24"/>
+        </w:rPr>
+        <w:t xml:space="preserve">Test Accuracy (depth=6): </w:t>
+      </w:r>
+      <w:r>
+        <w:rPr>
+          <w:rFonts w:ascii="Times New Roman" w:hAnsi="Times New Roman"/>
+          <w:sz w:val="24"/>
+        </w:rPr>
+        <w:t>75.31%</w:t>
+      </w:r>
+    </w:p>
+    <w:p>
+      <w:pPr>
+        <w:spacing w:before="0" w:after="40" w:line="240" w:lineRule="auto"/>
+      </w:pPr>
+      <w:r>
+        <w:rPr>
+          <w:rFonts w:ascii="Times New Roman" w:hAnsi="Times New Roman"/>
+          <w:b/>
+          <w:sz w:val="24"/>
+        </w:rPr>
+        <w:t xml:space="preserve">Test Accuracy (depth=3, readable tree): </w:t>
+      </w:r>
+      <w:r>
+        <w:rPr>
+          <w:rFonts w:ascii="Times New Roman" w:hAnsi="Times New Roman"/>
+          <w:sz w:val="24"/>
+        </w:rPr>
+        <w:t>73.56%</w:t>
+      </w:r>
+    </w:p>
+    <w:p>
+      <w:pPr>
+        <w:spacing w:before="0" w:after="40" w:line="240" w:lineRule="auto"/>
+      </w:pPr>
+      <w:r>
+        <w:rPr>
+          <w:rFonts w:ascii="Times New Roman" w:hAnsi="Times New Roman"/>
+          <w:b/>
+          <w:sz w:val="24"/>
+        </w:rPr>
+        <w:t xml:space="preserve">Top Feature: </w:t>
+      </w:r>
+      <w:r>
+        <w:rPr>
+          <w:rFonts w:ascii="Times New Roman" w:hAnsi="Times New Roman"/>
+          <w:sz w:val="24"/>
+        </w:rPr>
+        <w:t>local_std (importance=0.885)</w:t>
+      </w:r>
+    </w:p>
+    <w:p>
+      <w:pPr>
+        <w:spacing w:before="0" w:after="120" w:line="240" w:lineRule="auto"/>
+      </w:pPr>
+      <w:r>
+        <w:rPr>
+          <w:rFonts w:ascii="Times New Roman" w:hAnsi="Times New Roman"/>
+          <w:b/>
+          <w:sz w:val="24"/>
+        </w:rPr>
+        <w:t xml:space="preserve">Execution Status: </w:t>
+      </w:r>
+      <w:r>
+        <w:rPr>
+          <w:rFonts w:ascii="Times New Roman" w:hAnsi="Times New Roman"/>
+          <w:sz w:val="24"/>
+        </w:rPr>
+        <w:t>Successfully Executed</w:t>
+      </w:r>
+    </w:p>
+    <w:p>
+      <w:pPr>
+        <w:spacing w:before="120" w:after="60" w:line="240" w:lineRule="auto"/>
+      </w:pPr>
+      <w:r>
+        <w:rPr>
+          <w:rFonts w:ascii="Times New Roman" w:hAnsi="Times New Roman"/>
+          <w:b/>
+          <w:sz w:val="24"/>
+        </w:rPr>
+        <w:t>Result Graph:</w:t>
+      </w:r>
+    </w:p>
+    <w:p>
+      <w:pPr>
+        <w:spacing w:before="0" w:after="40" w:line="240" w:lineRule="auto"/>
+      </w:pPr>
+      <w:r>
+        <w:rPr>
+          <w:rFonts w:ascii="Times New Roman" w:hAnsi="Times New Roman"/>
+          <w:b/>
+          <w:i w:val="0"/>
+          <w:sz w:val="24"/>
+        </w:rPr>
+        <w:t>Figure: Visualized Decision Tree (max_depth=3, readable).</w:t>
+      </w:r>
+    </w:p>
+    <w:p>
+      <w:pPr>
+        <w:spacing w:before="0" w:after="20" w:line="240" w:lineRule="auto"/>
+      </w:pPr>
+      <w:r>
+        <w:rPr>
+          <w:rFonts w:ascii="Times New Roman" w:hAnsi="Times New Roman"/>
+          <w:b/>
+          <w:sz w:val="24"/>
+        </w:rPr>
+        <w:t xml:space="preserve">X-axis: </w:t>
+      </w:r>
+      <w:r>
+        <w:rPr>
+          <w:rFonts w:ascii="Times New Roman" w:hAnsi="Times New Roman"/>
+          <w:sz w:val="24"/>
+        </w:rPr>
+        <w:t>Feature splits (root to leaves)</w:t>
+      </w:r>
+    </w:p>
+    <w:p>
+      <w:pPr>
+        <w:spacing w:before="0" w:after="80" w:line="240" w:lineRule="auto"/>
+      </w:pPr>
+      <w:r>
+        <w:rPr>
+          <w:rFonts w:ascii="Times New Roman" w:hAnsi="Times New Roman"/>
+          <w:b/>
+          <w:sz w:val="24"/>
+        </w:rPr>
+        <w:t xml:space="preserve">Y-axis: </w:t>
+      </w:r>
+      <w:r>
+        <w:rPr>
+          <w:rFonts w:ascii="Times New Roman" w:hAnsi="Times New Roman"/>
+          <w:sz w:val="24"/>
+        </w:rPr>
+        <w:t>Tree depth</w:t>
+      </w:r>
+    </w:p>
+    <w:p>
+      <w:pPr>
+        <w:spacing w:before="0" w:after="40" w:line="240" w:lineRule="auto"/>
         <w:jc w:val="center"/>
       </w:pPr>
       <w:r>
         <w:drawing>
           <wp:inline xmlns:a="http://schemas.openxmlformats.org/drawingml/2006/main" xmlns:pic="http://schemas.openxmlformats.org/drawingml/2006/picture">
-            <wp:extent cx="5029200" cy="2618267"/>
+            <wp:extent cx="4937760" cy="2570663"/>
             <wp:docPr id="1" name="Picture 1"/>
             <wp:cNvGraphicFramePr>
               <a:graphicFrameLocks noChangeAspect="1"/>
@@ -1166,7 +830,7 @@
                   <pic:spPr>
                     <a:xfrm>
                       <a:off x="0" y="0"/>
-                      <a:ext cx="5029200" cy="2618267"/>
+                      <a:ext cx="4937760" cy="2570663"/>
                     </a:xfrm>
                     <a:prstGeom prst="rect"/>
                   </pic:spPr>
@@ -1179,41 +843,471 @@
     </w:p>
     <w:p>
       <w:pPr>
-        <w:spacing w:after="80"/>
-        <w:jc w:val="center"/>
+        <w:spacing w:before="0" w:after="160" w:line="240" w:lineRule="auto"/>
       </w:pPr>
       <w:r>
         <w:rPr>
-          <w:i/>
-          <w:sz w:val="16"/>
+          <w:rFonts w:ascii="Times New Roman" w:hAnsi="Times New Roman"/>
+          <w:b w:val="0"/>
+          <w:i w:val="0"/>
+          <w:sz w:val="24"/>
         </w:rPr>
-        <w:t>Visualized Decision Tree (max_depth=3, readable).</w:t>
+        <w:t>Each box shows the split condition, Gini impurity, sample count and majority class; local_std (local texture energy) dominates the top splits.</w:t>
       </w:r>
     </w:p>
     <w:p>
       <w:pPr>
-        <w:spacing w:before="120" w:after="60"/>
+        <w:spacing w:before="120" w:after="60" w:line="240" w:lineRule="auto"/>
       </w:pPr>
       <w:r>
         <w:rPr>
+          <w:rFonts w:ascii="Times New Roman" w:hAnsi="Times New Roman"/>
           <w:b/>
-          <w:color w:val="1F4E79"/>
-          <w:sz w:val="26"/>
+          <w:sz w:val="24"/>
         </w:rPr>
-        <w:t>Result</w:t>
+        <w:t>Parameter Modification:</w:t>
       </w:r>
     </w:p>
     <w:p>
+      <w:pPr>
+        <w:spacing w:before="0" w:after="80" w:line="240" w:lineRule="auto"/>
+      </w:pPr>
       <w:r>
         <w:rPr>
-          <w:sz w:val="20"/>
+          <w:rFonts w:ascii="Times New Roman" w:hAnsi="Times New Roman"/>
+          <w:b w:val="0"/>
+          <w:i w:val="0"/>
+          <w:sz w:val="24"/>
         </w:rPr>
-        <w:t>The depth-6 tree reached 75.31% test accuracy. local_std (local texture energy) dominates the splits, confirming texture is the strongest edge indicator in this feature set.</w:t>
+        <w:t>Effect of varying max_depth (the key regularization hyperparameter) on test accuracy:</w:t>
+      </w:r>
+    </w:p>
+    <w:tbl>
+      <w:tblPr>
+        <w:tblStyle w:val="LightGrid-Accent1"/>
+        <w:tblW w:type="auto" w:w="0"/>
+        <w:tblLook w:firstColumn="1" w:firstRow="1" w:lastColumn="0" w:lastRow="0" w:noHBand="0" w:noVBand="1" w:val="04A0"/>
+      </w:tblPr>
+      <w:tblGrid>
+        <w:gridCol w:w="4657"/>
+        <w:gridCol w:w="4657"/>
+      </w:tblGrid>
+      <w:tr>
+        <w:tc>
+          <w:tcPr>
+            <w:tcW w:type="dxa" w:w="4657"/>
+          </w:tcPr>
+          <w:p>
+            <w:pPr>
+              <w:spacing w:before="0" w:after="0" w:line="240" w:lineRule="auto"/>
+            </w:pPr>
+            <w:r>
+              <w:rPr>
+                <w:rFonts w:ascii="Times New Roman" w:hAnsi="Times New Roman"/>
+                <w:b/>
+                <w:sz w:val="20"/>
+              </w:rPr>
+              <w:t>max_depth</w:t>
+            </w:r>
+          </w:p>
+        </w:tc>
+        <w:tc>
+          <w:tcPr>
+            <w:tcW w:type="dxa" w:w="4657"/>
+          </w:tcPr>
+          <w:p>
+            <w:pPr>
+              <w:spacing w:before="0" w:after="0" w:line="240" w:lineRule="auto"/>
+            </w:pPr>
+            <w:r>
+              <w:rPr>
+                <w:rFonts w:ascii="Times New Roman" w:hAnsi="Times New Roman"/>
+                <w:b/>
+                <w:sz w:val="20"/>
+              </w:rPr>
+              <w:t>Test Accuracy</w:t>
+            </w:r>
+          </w:p>
+        </w:tc>
+      </w:tr>
+      <w:tr>
+        <w:tc>
+          <w:tcPr>
+            <w:tcW w:type="dxa" w:w="4657"/>
+          </w:tcPr>
+          <w:p>
+            <w:pPr>
+              <w:spacing w:before="0" w:after="0" w:line="240" w:lineRule="auto"/>
+            </w:pPr>
+            <w:r>
+              <w:rPr>
+                <w:rFonts w:ascii="Times New Roman" w:hAnsi="Times New Roman"/>
+                <w:sz w:val="20"/>
+              </w:rPr>
+              <w:t>1</w:t>
+            </w:r>
+          </w:p>
+        </w:tc>
+        <w:tc>
+          <w:tcPr>
+            <w:tcW w:type="dxa" w:w="4657"/>
+          </w:tcPr>
+          <w:p>
+            <w:pPr>
+              <w:spacing w:before="0" w:after="0" w:line="240" w:lineRule="auto"/>
+            </w:pPr>
+            <w:r>
+              <w:rPr>
+                <w:rFonts w:ascii="Times New Roman" w:hAnsi="Times New Roman"/>
+                <w:sz w:val="20"/>
+              </w:rPr>
+              <w:t>0.7373</w:t>
+            </w:r>
+          </w:p>
+        </w:tc>
+      </w:tr>
+      <w:tr>
+        <w:tc>
+          <w:tcPr>
+            <w:tcW w:type="dxa" w:w="4657"/>
+          </w:tcPr>
+          <w:p>
+            <w:pPr>
+              <w:spacing w:before="0" w:after="0" w:line="240" w:lineRule="auto"/>
+            </w:pPr>
+            <w:r>
+              <w:rPr>
+                <w:rFonts w:ascii="Times New Roman" w:hAnsi="Times New Roman"/>
+                <w:sz w:val="20"/>
+              </w:rPr>
+              <w:t>2</w:t>
+            </w:r>
+          </w:p>
+        </w:tc>
+        <w:tc>
+          <w:tcPr>
+            <w:tcW w:type="dxa" w:w="4657"/>
+          </w:tcPr>
+          <w:p>
+            <w:pPr>
+              <w:spacing w:before="0" w:after="0" w:line="240" w:lineRule="auto"/>
+            </w:pPr>
+            <w:r>
+              <w:rPr>
+                <w:rFonts w:ascii="Times New Roman" w:hAnsi="Times New Roman"/>
+                <w:sz w:val="20"/>
+              </w:rPr>
+              <w:t>0.7373</w:t>
+            </w:r>
+          </w:p>
+        </w:tc>
+      </w:tr>
+      <w:tr>
+        <w:tc>
+          <w:tcPr>
+            <w:tcW w:type="dxa" w:w="4657"/>
+          </w:tcPr>
+          <w:p>
+            <w:pPr>
+              <w:spacing w:before="0" w:after="0" w:line="240" w:lineRule="auto"/>
+            </w:pPr>
+            <w:r>
+              <w:rPr>
+                <w:rFonts w:ascii="Times New Roman" w:hAnsi="Times New Roman"/>
+                <w:sz w:val="20"/>
+              </w:rPr>
+              <w:t>3</w:t>
+            </w:r>
+          </w:p>
+        </w:tc>
+        <w:tc>
+          <w:tcPr>
+            <w:tcW w:type="dxa" w:w="4657"/>
+          </w:tcPr>
+          <w:p>
+            <w:pPr>
+              <w:spacing w:before="0" w:after="0" w:line="240" w:lineRule="auto"/>
+            </w:pPr>
+            <w:r>
+              <w:rPr>
+                <w:rFonts w:ascii="Times New Roman" w:hAnsi="Times New Roman"/>
+                <w:sz w:val="20"/>
+              </w:rPr>
+              <w:t>0.7356</w:t>
+            </w:r>
+          </w:p>
+        </w:tc>
+      </w:tr>
+      <w:tr>
+        <w:tc>
+          <w:tcPr>
+            <w:tcW w:type="dxa" w:w="4657"/>
+          </w:tcPr>
+          <w:p>
+            <w:pPr>
+              <w:spacing w:before="0" w:after="0" w:line="240" w:lineRule="auto"/>
+            </w:pPr>
+            <w:r>
+              <w:rPr>
+                <w:rFonts w:ascii="Times New Roman" w:hAnsi="Times New Roman"/>
+                <w:sz w:val="20"/>
+              </w:rPr>
+              <w:t>4</w:t>
+            </w:r>
+          </w:p>
+        </w:tc>
+        <w:tc>
+          <w:tcPr>
+            <w:tcW w:type="dxa" w:w="4657"/>
+          </w:tcPr>
+          <w:p>
+            <w:pPr>
+              <w:spacing w:before="0" w:after="0" w:line="240" w:lineRule="auto"/>
+            </w:pPr>
+            <w:r>
+              <w:rPr>
+                <w:rFonts w:ascii="Times New Roman" w:hAnsi="Times New Roman"/>
+                <w:sz w:val="20"/>
+              </w:rPr>
+              <w:t>0.7425</w:t>
+            </w:r>
+          </w:p>
+        </w:tc>
+      </w:tr>
+      <w:tr>
+        <w:tc>
+          <w:tcPr>
+            <w:tcW w:type="dxa" w:w="4657"/>
+          </w:tcPr>
+          <w:p>
+            <w:pPr>
+              <w:spacing w:before="0" w:after="0" w:line="240" w:lineRule="auto"/>
+            </w:pPr>
+            <w:r>
+              <w:rPr>
+                <w:rFonts w:ascii="Times New Roman" w:hAnsi="Times New Roman"/>
+                <w:sz w:val="20"/>
+              </w:rPr>
+              <w:t>5</w:t>
+            </w:r>
+          </w:p>
+        </w:tc>
+        <w:tc>
+          <w:tcPr>
+            <w:tcW w:type="dxa" w:w="4657"/>
+          </w:tcPr>
+          <w:p>
+            <w:pPr>
+              <w:spacing w:before="0" w:after="0" w:line="240" w:lineRule="auto"/>
+            </w:pPr>
+            <w:r>
+              <w:rPr>
+                <w:rFonts w:ascii="Times New Roman" w:hAnsi="Times New Roman"/>
+                <w:sz w:val="20"/>
+              </w:rPr>
+              <w:t>0.7494</w:t>
+            </w:r>
+          </w:p>
+        </w:tc>
+      </w:tr>
+      <w:tr>
+        <w:tc>
+          <w:tcPr>
+            <w:tcW w:type="dxa" w:w="4657"/>
+          </w:tcPr>
+          <w:p>
+            <w:pPr>
+              <w:spacing w:before="0" w:after="0" w:line="240" w:lineRule="auto"/>
+            </w:pPr>
+            <w:r>
+              <w:rPr>
+                <w:rFonts w:ascii="Times New Roman" w:hAnsi="Times New Roman"/>
+                <w:sz w:val="20"/>
+              </w:rPr>
+              <w:t>6</w:t>
+            </w:r>
+          </w:p>
+        </w:tc>
+        <w:tc>
+          <w:tcPr>
+            <w:tcW w:type="dxa" w:w="4657"/>
+          </w:tcPr>
+          <w:p>
+            <w:pPr>
+              <w:spacing w:before="0" w:after="0" w:line="240" w:lineRule="auto"/>
+            </w:pPr>
+            <w:r>
+              <w:rPr>
+                <w:rFonts w:ascii="Times New Roman" w:hAnsi="Times New Roman"/>
+                <w:sz w:val="20"/>
+              </w:rPr>
+              <w:t>0.7531</w:t>
+            </w:r>
+          </w:p>
+        </w:tc>
+      </w:tr>
+      <w:tr>
+        <w:tc>
+          <w:tcPr>
+            <w:tcW w:type="dxa" w:w="4657"/>
+          </w:tcPr>
+          <w:p>
+            <w:pPr>
+              <w:spacing w:before="0" w:after="0" w:line="240" w:lineRule="auto"/>
+            </w:pPr>
+            <w:r>
+              <w:rPr>
+                <w:rFonts w:ascii="Times New Roman" w:hAnsi="Times New Roman"/>
+                <w:sz w:val="20"/>
+              </w:rPr>
+              <w:t>8</w:t>
+            </w:r>
+          </w:p>
+        </w:tc>
+        <w:tc>
+          <w:tcPr>
+            <w:tcW w:type="dxa" w:w="4657"/>
+          </w:tcPr>
+          <w:p>
+            <w:pPr>
+              <w:spacing w:before="0" w:after="0" w:line="240" w:lineRule="auto"/>
+            </w:pPr>
+            <w:r>
+              <w:rPr>
+                <w:rFonts w:ascii="Times New Roman" w:hAnsi="Times New Roman"/>
+                <w:sz w:val="20"/>
+              </w:rPr>
+              <w:t>0.7527</w:t>
+            </w:r>
+          </w:p>
+        </w:tc>
+      </w:tr>
+      <w:tr>
+        <w:tc>
+          <w:tcPr>
+            <w:tcW w:type="dxa" w:w="4657"/>
+          </w:tcPr>
+          <w:p>
+            <w:pPr>
+              <w:spacing w:before="0" w:after="0" w:line="240" w:lineRule="auto"/>
+            </w:pPr>
+            <w:r>
+              <w:rPr>
+                <w:rFonts w:ascii="Times New Roman" w:hAnsi="Times New Roman"/>
+                <w:sz w:val="20"/>
+              </w:rPr>
+              <w:t>10</w:t>
+            </w:r>
+          </w:p>
+        </w:tc>
+        <w:tc>
+          <w:tcPr>
+            <w:tcW w:type="dxa" w:w="4657"/>
+          </w:tcPr>
+          <w:p>
+            <w:pPr>
+              <w:spacing w:before="0" w:after="0" w:line="240" w:lineRule="auto"/>
+            </w:pPr>
+            <w:r>
+              <w:rPr>
+                <w:rFonts w:ascii="Times New Roman" w:hAnsi="Times New Roman"/>
+                <w:sz w:val="20"/>
+              </w:rPr>
+              <w:t>0.7452</w:t>
+            </w:r>
+          </w:p>
+        </w:tc>
+      </w:tr>
+      <w:tr>
+        <w:tc>
+          <w:tcPr>
+            <w:tcW w:type="dxa" w:w="4657"/>
+          </w:tcPr>
+          <w:p>
+            <w:pPr>
+              <w:spacing w:before="0" w:after="0" w:line="240" w:lineRule="auto"/>
+            </w:pPr>
+            <w:r>
+              <w:rPr>
+                <w:rFonts w:ascii="Times New Roman" w:hAnsi="Times New Roman"/>
+                <w:sz w:val="20"/>
+              </w:rPr>
+              <w:t>15</w:t>
+            </w:r>
+          </w:p>
+        </w:tc>
+        <w:tc>
+          <w:tcPr>
+            <w:tcW w:type="dxa" w:w="4657"/>
+          </w:tcPr>
+          <w:p>
+            <w:pPr>
+              <w:spacing w:before="0" w:after="0" w:line="240" w:lineRule="auto"/>
+            </w:pPr>
+            <w:r>
+              <w:rPr>
+                <w:rFonts w:ascii="Times New Roman" w:hAnsi="Times New Roman"/>
+                <w:sz w:val="20"/>
+              </w:rPr>
+              <w:t>0.7304</w:t>
+            </w:r>
+          </w:p>
+        </w:tc>
+      </w:tr>
+      <w:tr>
+        <w:tc>
+          <w:tcPr>
+            <w:tcW w:type="dxa" w:w="4657"/>
+          </w:tcPr>
+          <w:p>
+            <w:pPr>
+              <w:spacing w:before="0" w:after="0" w:line="240" w:lineRule="auto"/>
+            </w:pPr>
+            <w:r>
+              <w:rPr>
+                <w:rFonts w:ascii="Times New Roman" w:hAnsi="Times New Roman"/>
+                <w:sz w:val="20"/>
+              </w:rPr>
+              <w:t>None</w:t>
+            </w:r>
+          </w:p>
+        </w:tc>
+        <w:tc>
+          <w:tcPr>
+            <w:tcW w:type="dxa" w:w="4657"/>
+          </w:tcPr>
+          <w:p>
+            <w:pPr>
+              <w:spacing w:before="0" w:after="0" w:line="240" w:lineRule="auto"/>
+            </w:pPr>
+            <w:r>
+              <w:rPr>
+                <w:rFonts w:ascii="Times New Roman" w:hAnsi="Times New Roman"/>
+                <w:sz w:val="20"/>
+              </w:rPr>
+              <w:t>0.7277</w:t>
+            </w:r>
+          </w:p>
+        </w:tc>
+      </w:tr>
+    </w:tbl>
+    <w:p>
+      <w:pPr>
+        <w:spacing w:before="0" w:after="80" w:line="240" w:lineRule="auto"/>
+      </w:pPr>
+      <w:r>
+        <w:rPr>
+          <w:rFonts w:ascii="Times New Roman" w:hAnsi="Times New Roman"/>
+          <w:b w:val="0"/>
+          <w:i w:val="0"/>
+          <w:sz w:val="24"/>
+        </w:rPr>
+        <w:t>Accuracy improves as depth increases up to depth=6-8, then declines as the tree overfits (depth=15 and unbounded depth score lower than depth=6), confirming max_depth is an effective regularizer.</w:t>
       </w:r>
     </w:p>
     <w:sectPr>
-      <w:pgSz w:w="12240" w:h="15840"/>
-      <w:pgMar w:top="1008" w:right="1008" w:bottom="1008" w:left="1008" w:header="720" w:footer="720" w:gutter="0"/>
+      <w:pgSz w:w="11906" w:h="16838"/>
+      <w:pgMar w:top="1152" w:right="1296" w:bottom="1152" w:left="1296" w:header="720" w:footer="720" w:gutter="0"/>
       <w:cols w:space="720"/>
       <w:docGrid w:linePitch="360"/>
     </w:sectPr>
@@ -1585,8 +1679,8 @@
     <w:qFormat/>
     <w:rsid w:val="00FC693F"/>
     <w:rPr>
-      <w:rFonts w:ascii="Calibri" w:hAnsi="Calibri"/>
-      <w:sz w:val="20"/>
+      <w:rFonts w:ascii="Times New Roman" w:hAnsi="Times New Roman" w:eastAsia="Times New Roman"/>
+      <w:sz w:val="24"/>
     </w:rPr>
   </w:style>
   <w:style w:type="paragraph" w:styleId="Header">

</xml_diff>